<commit_message>
add JWT-demo and finish
</commit_message>
<xml_diff>
--- a/Lab01/LAB01_Report.docx
+++ b/Lab01/LAB01_Report.docx
@@ -1,6 +1,6 @@
 
 <file path=word/document.xml><?xml version="1.0" encoding="utf-8"?>
-<w:document xmlns:wpc="http://schemas.microsoft.com/office/word/2010/wordprocessingCanvas" xmlns:mc="http://schemas.openxmlformats.org/markup-compatibility/2006" xmlns:o="urn:schemas-microsoft-com:office:office" xmlns:r="http://schemas.openxmlformats.org/officeDocument/2006/relationships" xmlns:m="http://schemas.openxmlformats.org/officeDocument/2006/math" xmlns:v="urn:schemas-microsoft-com:vml" xmlns:wp14="http://schemas.microsoft.com/office/word/2010/wordprocessingDrawing" xmlns:wp="http://schemas.openxmlformats.org/drawingml/2006/wordprocessingDrawing" xmlns:w10="urn:schemas-microsoft-com:office:word" xmlns:w="http://schemas.openxmlformats.org/wordprocessingml/2006/main" xmlns:w14="http://schemas.microsoft.com/office/word/2010/wordml" xmlns:w15="http://schemas.microsoft.com/office/word/2012/wordml" xmlns:wpg="http://schemas.microsoft.com/office/word/2010/wordprocessingGroup" xmlns:wpi="http://schemas.microsoft.com/office/word/2010/wordprocessingInk" xmlns:wne="http://schemas.microsoft.com/office/word/2006/wordml" xmlns:wps="http://schemas.microsoft.com/office/word/2010/wordprocessingShape" mc:Ignorable="w14 w15 wp14">
+<w:document xmlns:wpc="http://schemas.microsoft.com/office/word/2010/wordprocessingCanvas" xmlns:cx="http://schemas.microsoft.com/office/drawing/2014/chartex" xmlns:cx1="http://schemas.microsoft.com/office/drawing/2015/9/8/chartex" xmlns:cx2="http://schemas.microsoft.com/office/drawing/2015/10/21/chartex" xmlns:cx3="http://schemas.microsoft.com/office/drawing/2016/5/9/chartex" xmlns:cx4="http://schemas.microsoft.com/office/drawing/2016/5/10/chartex" xmlns:cx5="http://schemas.microsoft.com/office/drawing/2016/5/11/chartex" xmlns:cx6="http://schemas.microsoft.com/office/drawing/2016/5/12/chartex" xmlns:cx7="http://schemas.microsoft.com/office/drawing/2016/5/13/chartex" xmlns:cx8="http://schemas.microsoft.com/office/drawing/2016/5/14/chartex" xmlns:mc="http://schemas.openxmlformats.org/markup-compatibility/2006" xmlns:aink="http://schemas.microsoft.com/office/drawing/2016/ink" xmlns:am3d="http://schemas.microsoft.com/office/drawing/2017/model3d" xmlns:o="urn:schemas-microsoft-com:office:office" xmlns:oel="http://schemas.microsoft.com/office/2019/extlst" xmlns:r="http://schemas.openxmlformats.org/officeDocument/2006/relationships" xmlns:m="http://schemas.openxmlformats.org/officeDocument/2006/math" xmlns:v="urn:schemas-microsoft-com:vml" xmlns:wp14="http://schemas.microsoft.com/office/word/2010/wordprocessingDrawing" xmlns:wp="http://schemas.openxmlformats.org/drawingml/2006/wordprocessingDrawing" xmlns:w10="urn:schemas-microsoft-com:office:word" xmlns:w="http://schemas.openxmlformats.org/wordprocessingml/2006/main" xmlns:w14="http://schemas.microsoft.com/office/word/2010/wordml" xmlns:w15="http://schemas.microsoft.com/office/word/2012/wordml" xmlns:w16cex="http://schemas.microsoft.com/office/word/2018/wordml/cex" xmlns:w16cid="http://schemas.microsoft.com/office/word/2016/wordml/cid" xmlns:w16="http://schemas.microsoft.com/office/word/2018/wordml" xmlns:w16du="http://schemas.microsoft.com/office/word/2023/wordml/word16du" xmlns:w16sdtdh="http://schemas.microsoft.com/office/word/2020/wordml/sdtdatahash" xmlns:w16sdtfl="http://schemas.microsoft.com/office/word/2024/wordml/sdtformatlock" xmlns:w16se="http://schemas.microsoft.com/office/word/2015/wordml/symex" xmlns:wpg="http://schemas.microsoft.com/office/word/2010/wordprocessingGroup" xmlns:wpi="http://schemas.microsoft.com/office/word/2010/wordprocessingInk" xmlns:wne="http://schemas.microsoft.com/office/word/2006/wordml" xmlns:wps="http://schemas.microsoft.com/office/word/2010/wordprocessingShape" mc:Ignorable="w14 w15 w16se w16cid w16 w16cex w16sdtdh w16sdtfl w16du wp14">
   <w:body>
     <w:p>
       <w:pPr>
@@ -34,8 +34,26 @@
           <w:sz w:val="26"/>
           <w:szCs w:val="26"/>
         </w:rPr>
+        <w:t>MessageQueue:</w:t>
+      </w:r>
+    </w:p>
+    <w:p>
+      <w:pPr>
+        <w:rPr>
+          <w:rFonts w:ascii="Times New Roman" w:hAnsi="Times New Roman" w:cs="Times New Roman"/>
+          <w:sz w:val="26"/>
+          <w:szCs w:val="26"/>
+        </w:rPr>
+      </w:pPr>
+      <w:r>
+        <w:rPr>
+          <w:rFonts w:ascii="Times New Roman" w:hAnsi="Times New Roman" w:cs="Times New Roman"/>
+          <w:noProof/>
+          <w:sz w:val="26"/>
+          <w:szCs w:val="26"/>
+        </w:rPr>
         <w:drawing>
-          <wp:inline distT="0" distB="0" distL="0" distR="0" wp14:anchorId="5D9B4285" wp14:editId="72D484D9">
+          <wp:inline distT="0" distB="0" distL="0" distR="0" wp14:anchorId="799C1ADD" wp14:editId="74BF9162">
             <wp:extent cx="5943600" cy="3251200"/>
             <wp:effectExtent l="0" t="0" r="0" b="6350"/>
             <wp:docPr id="1" name="Picture 1"/>
@@ -91,11 +109,12 @@
       <w:r>
         <w:rPr>
           <w:rFonts w:ascii="Times New Roman" w:hAnsi="Times New Roman" w:cs="Times New Roman"/>
+          <w:noProof/>
           <w:sz w:val="26"/>
           <w:szCs w:val="26"/>
         </w:rPr>
         <w:drawing>
-          <wp:inline distT="0" distB="0" distL="0" distR="0" wp14:anchorId="1B14D96E" wp14:editId="3105F2F9">
+          <wp:inline distT="0" distB="0" distL="0" distR="0" wp14:anchorId="74395B9A" wp14:editId="577C1EA7">
             <wp:extent cx="5943600" cy="3371850"/>
             <wp:effectExtent l="0" t="0" r="0" b="0"/>
             <wp:docPr id="2" name="Picture 2"/>
@@ -151,12 +170,13 @@
       <w:r>
         <w:rPr>
           <w:rFonts w:ascii="Times New Roman" w:hAnsi="Times New Roman" w:cs="Times New Roman"/>
+          <w:noProof/>
           <w:sz w:val="26"/>
           <w:szCs w:val="26"/>
         </w:rPr>
         <w:lastRenderedPageBreak/>
         <w:drawing>
-          <wp:inline distT="0" distB="0" distL="0" distR="0" wp14:anchorId="3CBEB754" wp14:editId="0808585D">
+          <wp:inline distT="0" distB="0" distL="0" distR="0" wp14:anchorId="4FB0C24F" wp14:editId="4B1B4224">
             <wp:extent cx="5943600" cy="2473325"/>
             <wp:effectExtent l="0" t="0" r="0" b="3175"/>
             <wp:docPr id="3" name="Picture 3"/>
@@ -212,11 +232,12 @@
       <w:r>
         <w:rPr>
           <w:rFonts w:ascii="Times New Roman" w:hAnsi="Times New Roman" w:cs="Times New Roman"/>
+          <w:noProof/>
           <w:sz w:val="26"/>
           <w:szCs w:val="26"/>
         </w:rPr>
         <w:drawing>
-          <wp:inline distT="0" distB="0" distL="0" distR="0" wp14:anchorId="54663BE5" wp14:editId="4A958DE2">
+          <wp:inline distT="0" distB="0" distL="0" distR="0" wp14:anchorId="6FC53910" wp14:editId="7C2B20C8">
             <wp:extent cx="5943600" cy="4382770"/>
             <wp:effectExtent l="0" t="0" r="0" b="0"/>
             <wp:docPr id="4" name="Picture 4"/>
@@ -272,12 +293,13 @@
       <w:r>
         <w:rPr>
           <w:rFonts w:ascii="Times New Roman" w:hAnsi="Times New Roman" w:cs="Times New Roman"/>
+          <w:noProof/>
           <w:sz w:val="26"/>
           <w:szCs w:val="26"/>
         </w:rPr>
         <w:lastRenderedPageBreak/>
         <w:drawing>
-          <wp:inline distT="0" distB="0" distL="0" distR="0" wp14:anchorId="047E5982" wp14:editId="4598E0BC">
+          <wp:inline distT="0" distB="0" distL="0" distR="0" wp14:anchorId="1D95902B" wp14:editId="0DC890AD">
             <wp:extent cx="5943600" cy="1877695"/>
             <wp:effectExtent l="0" t="0" r="0" b="8255"/>
             <wp:docPr id="5" name="Picture 5"/>
@@ -350,11 +372,12 @@
       <w:r>
         <w:rPr>
           <w:rFonts w:ascii="Times New Roman" w:hAnsi="Times New Roman" w:cs="Times New Roman"/>
+          <w:noProof/>
           <w:sz w:val="26"/>
           <w:szCs w:val="26"/>
         </w:rPr>
         <w:drawing>
-          <wp:inline distT="0" distB="0" distL="0" distR="0" wp14:anchorId="0697FDB8" wp14:editId="0DF5A819">
+          <wp:inline distT="0" distB="0" distL="0" distR="0" wp14:anchorId="6262E229" wp14:editId="068B2A45">
             <wp:extent cx="5943600" cy="3391535"/>
             <wp:effectExtent l="0" t="0" r="0" b="0"/>
             <wp:docPr id="6" name="Picture 6"/>
@@ -401,12 +424,13 @@
       <w:r>
         <w:rPr>
           <w:rFonts w:ascii="Times New Roman" w:hAnsi="Times New Roman" w:cs="Times New Roman"/>
+          <w:noProof/>
           <w:sz w:val="26"/>
           <w:szCs w:val="26"/>
         </w:rPr>
         <w:lastRenderedPageBreak/>
         <w:drawing>
-          <wp:inline distT="0" distB="0" distL="0" distR="0" wp14:anchorId="1EF32964" wp14:editId="05CCA4C9">
+          <wp:inline distT="0" distB="0" distL="0" distR="0" wp14:anchorId="23E157B5" wp14:editId="16EE8EE7">
             <wp:extent cx="5943600" cy="2287905"/>
             <wp:effectExtent l="0" t="0" r="0" b="0"/>
             <wp:docPr id="7" name="Picture 7"/>
@@ -441,11 +465,211 @@
           </wp:inline>
         </w:drawing>
       </w:r>
-      <w:bookmarkStart w:id="0" w:name="_GoBack"/>
-      <w:bookmarkEnd w:id="0"/>
+    </w:p>
+    <w:p>
+      <w:pPr>
+        <w:rPr>
+          <w:rFonts w:ascii="Times New Roman" w:hAnsi="Times New Roman" w:cs="Times New Roman"/>
+          <w:sz w:val="26"/>
+          <w:szCs w:val="26"/>
+        </w:rPr>
+      </w:pPr>
+    </w:p>
+    <w:p>
+      <w:pPr>
+        <w:rPr>
+          <w:rFonts w:ascii="Times New Roman" w:hAnsi="Times New Roman" w:cs="Times New Roman"/>
+          <w:sz w:val="26"/>
+          <w:szCs w:val="26"/>
+        </w:rPr>
+      </w:pPr>
+      <w:r>
+        <w:rPr>
+          <w:rFonts w:ascii="Times New Roman" w:hAnsi="Times New Roman" w:cs="Times New Roman"/>
+          <w:sz w:val="26"/>
+          <w:szCs w:val="26"/>
+        </w:rPr>
+        <w:t>JWT:</w:t>
+      </w:r>
+    </w:p>
+    <w:p>
+      <w:pPr>
+        <w:rPr>
+          <w:rFonts w:ascii="Times New Roman" w:hAnsi="Times New Roman" w:cs="Times New Roman"/>
+          <w:sz w:val="26"/>
+          <w:szCs w:val="26"/>
+        </w:rPr>
+      </w:pPr>
+      <w:r>
+        <w:rPr>
+          <w:rFonts w:ascii="Times New Roman" w:hAnsi="Times New Roman" w:cs="Times New Roman"/>
+          <w:noProof/>
+          <w:sz w:val="26"/>
+          <w:szCs w:val="26"/>
+        </w:rPr>
+        <w:drawing>
+          <wp:inline distT="0" distB="0" distL="0" distR="0" wp14:anchorId="5B97C7DF" wp14:editId="72E2416B">
+            <wp:extent cx="5943600" cy="3342005"/>
+            <wp:effectExtent l="0" t="0" r="0" b="0"/>
+            <wp:docPr id="1486713722" name="Picture 1"/>
+            <wp:cNvGraphicFramePr>
+              <a:graphicFrameLocks xmlns:a="http://schemas.openxmlformats.org/drawingml/2006/main" noChangeAspect="1"/>
+            </wp:cNvGraphicFramePr>
+            <a:graphic xmlns:a="http://schemas.openxmlformats.org/drawingml/2006/main">
+              <a:graphicData uri="http://schemas.openxmlformats.org/drawingml/2006/picture">
+                <pic:pic xmlns:pic="http://schemas.openxmlformats.org/drawingml/2006/picture">
+                  <pic:nvPicPr>
+                    <pic:cNvPr id="1486713722" name="Picture 1486713722"/>
+                    <pic:cNvPicPr/>
+                  </pic:nvPicPr>
+                  <pic:blipFill>
+                    <a:blip r:embed="rId13" cstate="print">
+                      <a:extLst>
+                        <a:ext uri="{28A0092B-C50C-407E-A947-70E740481C1C}">
+                          <a14:useLocalDpi xmlns:a14="http://schemas.microsoft.com/office/drawing/2010/main" val="0"/>
+                        </a:ext>
+                      </a:extLst>
+                    </a:blip>
+                    <a:stretch>
+                      <a:fillRect/>
+                    </a:stretch>
+                  </pic:blipFill>
+                  <pic:spPr>
+                    <a:xfrm>
+                      <a:off x="0" y="0"/>
+                      <a:ext cx="5943600" cy="3342005"/>
+                    </a:xfrm>
+                    <a:prstGeom prst="rect">
+                      <a:avLst/>
+                    </a:prstGeom>
+                  </pic:spPr>
+                </pic:pic>
+              </a:graphicData>
+            </a:graphic>
+          </wp:inline>
+        </w:drawing>
+      </w:r>
+    </w:p>
+    <w:p>
+      <w:pPr>
+        <w:rPr>
+          <w:rFonts w:ascii="Times New Roman" w:hAnsi="Times New Roman" w:cs="Times New Roman"/>
+          <w:sz w:val="26"/>
+          <w:szCs w:val="26"/>
+        </w:rPr>
+      </w:pPr>
+      <w:r>
+        <w:rPr>
+          <w:rFonts w:ascii="Times New Roman" w:hAnsi="Times New Roman" w:cs="Times New Roman"/>
+          <w:noProof/>
+          <w:sz w:val="26"/>
+          <w:szCs w:val="26"/>
+        </w:rPr>
+        <w:lastRenderedPageBreak/>
+        <w:drawing>
+          <wp:inline distT="0" distB="0" distL="0" distR="0" wp14:anchorId="553F91AB" wp14:editId="3A1DA99A">
+            <wp:extent cx="5943600" cy="4993005"/>
+            <wp:effectExtent l="0" t="0" r="0" b="0"/>
+            <wp:docPr id="1157936905" name="Picture 2"/>
+            <wp:cNvGraphicFramePr>
+              <a:graphicFrameLocks xmlns:a="http://schemas.openxmlformats.org/drawingml/2006/main" noChangeAspect="1"/>
+            </wp:cNvGraphicFramePr>
+            <a:graphic xmlns:a="http://schemas.openxmlformats.org/drawingml/2006/main">
+              <a:graphicData uri="http://schemas.openxmlformats.org/drawingml/2006/picture">
+                <pic:pic xmlns:pic="http://schemas.openxmlformats.org/drawingml/2006/picture">
+                  <pic:nvPicPr>
+                    <pic:cNvPr id="1157936905" name="Picture 1157936905"/>
+                    <pic:cNvPicPr/>
+                  </pic:nvPicPr>
+                  <pic:blipFill>
+                    <a:blip r:embed="rId14">
+                      <a:extLst>
+                        <a:ext uri="{28A0092B-C50C-407E-A947-70E740481C1C}">
+                          <a14:useLocalDpi xmlns:a14="http://schemas.microsoft.com/office/drawing/2010/main" val="0"/>
+                        </a:ext>
+                      </a:extLst>
+                    </a:blip>
+                    <a:stretch>
+                      <a:fillRect/>
+                    </a:stretch>
+                  </pic:blipFill>
+                  <pic:spPr>
+                    <a:xfrm>
+                      <a:off x="0" y="0"/>
+                      <a:ext cx="5943600" cy="4993005"/>
+                    </a:xfrm>
+                    <a:prstGeom prst="rect">
+                      <a:avLst/>
+                    </a:prstGeom>
+                  </pic:spPr>
+                </pic:pic>
+              </a:graphicData>
+            </a:graphic>
+          </wp:inline>
+        </w:drawing>
+      </w:r>
+    </w:p>
+    <w:p>
+      <w:pPr>
+        <w:rPr>
+          <w:rFonts w:ascii="Times New Roman" w:hAnsi="Times New Roman" w:cs="Times New Roman"/>
+          <w:sz w:val="26"/>
+          <w:szCs w:val="26"/>
+        </w:rPr>
+      </w:pPr>
+      <w:r>
+        <w:rPr>
+          <w:rFonts w:ascii="Times New Roman" w:hAnsi="Times New Roman" w:cs="Times New Roman"/>
+          <w:noProof/>
+          <w:sz w:val="26"/>
+          <w:szCs w:val="26"/>
+        </w:rPr>
+        <w:lastRenderedPageBreak/>
+        <w:drawing>
+          <wp:inline distT="0" distB="0" distL="0" distR="0" wp14:anchorId="7BD01CC9" wp14:editId="60B74BC2">
+            <wp:extent cx="5943600" cy="4999355"/>
+            <wp:effectExtent l="0" t="0" r="0" b="0"/>
+            <wp:docPr id="1126351134" name="Picture 3"/>
+            <wp:cNvGraphicFramePr>
+              <a:graphicFrameLocks xmlns:a="http://schemas.openxmlformats.org/drawingml/2006/main" noChangeAspect="1"/>
+            </wp:cNvGraphicFramePr>
+            <a:graphic xmlns:a="http://schemas.openxmlformats.org/drawingml/2006/main">
+              <a:graphicData uri="http://schemas.openxmlformats.org/drawingml/2006/picture">
+                <pic:pic xmlns:pic="http://schemas.openxmlformats.org/drawingml/2006/picture">
+                  <pic:nvPicPr>
+                    <pic:cNvPr id="1126351134" name="Picture 1126351134"/>
+                    <pic:cNvPicPr/>
+                  </pic:nvPicPr>
+                  <pic:blipFill>
+                    <a:blip r:embed="rId15">
+                      <a:extLst>
+                        <a:ext uri="{28A0092B-C50C-407E-A947-70E740481C1C}">
+                          <a14:useLocalDpi xmlns:a14="http://schemas.microsoft.com/office/drawing/2010/main" val="0"/>
+                        </a:ext>
+                      </a:extLst>
+                    </a:blip>
+                    <a:stretch>
+                      <a:fillRect/>
+                    </a:stretch>
+                  </pic:blipFill>
+                  <pic:spPr>
+                    <a:xfrm>
+                      <a:off x="0" y="0"/>
+                      <a:ext cx="5943600" cy="4999355"/>
+                    </a:xfrm>
+                    <a:prstGeom prst="rect">
+                      <a:avLst/>
+                    </a:prstGeom>
+                  </pic:spPr>
+                </pic:pic>
+              </a:graphicData>
+            </a:graphic>
+          </wp:inline>
+        </w:drawing>
+      </w:r>
     </w:p>
     <w:sectPr>
-      <w:headerReference w:type="default" r:id="rId13"/>
+      <w:headerReference w:type="default" r:id="rId16"/>
       <w:pgSz w:w="12240" w:h="15840"/>
       <w:pgMar w:top="1440" w:right="1440" w:bottom="1440" w:left="1440" w:header="720" w:footer="720" w:gutter="0"/>
       <w:cols w:space="720"/>
@@ -456,7 +680,7 @@
 </file>
 
 <file path=word/endnotes.xml><?xml version="1.0" encoding="utf-8"?>
-<w:endnotes xmlns:wpc="http://schemas.microsoft.com/office/word/2010/wordprocessingCanvas" xmlns:mc="http://schemas.openxmlformats.org/markup-compatibility/2006" xmlns:o="urn:schemas-microsoft-com:office:office" xmlns:r="http://schemas.openxmlformats.org/officeDocument/2006/relationships" xmlns:m="http://schemas.openxmlformats.org/officeDocument/2006/math" xmlns:v="urn:schemas-microsoft-com:vml" xmlns:wp14="http://schemas.microsoft.com/office/word/2010/wordprocessingDrawing" xmlns:wp="http://schemas.openxmlformats.org/drawingml/2006/wordprocessingDrawing" xmlns:w10="urn:schemas-microsoft-com:office:word" xmlns:w="http://schemas.openxmlformats.org/wordprocessingml/2006/main" xmlns:w14="http://schemas.microsoft.com/office/word/2010/wordml" xmlns:w15="http://schemas.microsoft.com/office/word/2012/wordml" xmlns:wpg="http://schemas.microsoft.com/office/word/2010/wordprocessingGroup" xmlns:wpi="http://schemas.microsoft.com/office/word/2010/wordprocessingInk" xmlns:wne="http://schemas.microsoft.com/office/word/2006/wordml" xmlns:wps="http://schemas.microsoft.com/office/word/2010/wordprocessingShape" mc:Ignorable="w14 w15 wp14">
+<w:endnotes xmlns:wpc="http://schemas.microsoft.com/office/word/2010/wordprocessingCanvas" xmlns:cx="http://schemas.microsoft.com/office/drawing/2014/chartex" xmlns:cx1="http://schemas.microsoft.com/office/drawing/2015/9/8/chartex" xmlns:cx2="http://schemas.microsoft.com/office/drawing/2015/10/21/chartex" xmlns:cx3="http://schemas.microsoft.com/office/drawing/2016/5/9/chartex" xmlns:cx4="http://schemas.microsoft.com/office/drawing/2016/5/10/chartex" xmlns:cx5="http://schemas.microsoft.com/office/drawing/2016/5/11/chartex" xmlns:cx6="http://schemas.microsoft.com/office/drawing/2016/5/12/chartex" xmlns:cx7="http://schemas.microsoft.com/office/drawing/2016/5/13/chartex" xmlns:cx8="http://schemas.microsoft.com/office/drawing/2016/5/14/chartex" xmlns:mc="http://schemas.openxmlformats.org/markup-compatibility/2006" xmlns:aink="http://schemas.microsoft.com/office/drawing/2016/ink" xmlns:am3d="http://schemas.microsoft.com/office/drawing/2017/model3d" xmlns:o="urn:schemas-microsoft-com:office:office" xmlns:oel="http://schemas.microsoft.com/office/2019/extlst" xmlns:r="http://schemas.openxmlformats.org/officeDocument/2006/relationships" xmlns:m="http://schemas.openxmlformats.org/officeDocument/2006/math" xmlns:v="urn:schemas-microsoft-com:vml" xmlns:wp14="http://schemas.microsoft.com/office/word/2010/wordprocessingDrawing" xmlns:wp="http://schemas.openxmlformats.org/drawingml/2006/wordprocessingDrawing" xmlns:w10="urn:schemas-microsoft-com:office:word" xmlns:w="http://schemas.openxmlformats.org/wordprocessingml/2006/main" xmlns:w14="http://schemas.microsoft.com/office/word/2010/wordml" xmlns:w15="http://schemas.microsoft.com/office/word/2012/wordml" xmlns:w16cex="http://schemas.microsoft.com/office/word/2018/wordml/cex" xmlns:w16cid="http://schemas.microsoft.com/office/word/2016/wordml/cid" xmlns:w16="http://schemas.microsoft.com/office/word/2018/wordml" xmlns:w16du="http://schemas.microsoft.com/office/word/2023/wordml/word16du" xmlns:w16sdtdh="http://schemas.microsoft.com/office/word/2020/wordml/sdtdatahash" xmlns:w16sdtfl="http://schemas.microsoft.com/office/word/2024/wordml/sdtformatlock" xmlns:w16se="http://schemas.microsoft.com/office/word/2015/wordml/symex" xmlns:wpg="http://schemas.microsoft.com/office/word/2010/wordprocessingGroup" xmlns:wpi="http://schemas.microsoft.com/office/word/2010/wordprocessingInk" xmlns:wne="http://schemas.microsoft.com/office/word/2006/wordml" xmlns:wps="http://schemas.microsoft.com/office/word/2010/wordprocessingShape" mc:Ignorable="w14 w15 w16se w16cid w16 w16cex w16sdtdh w16sdtfl w16du wp14">
   <w:endnote w:type="separator" w:id="-1">
     <w:p>
       <w:pPr>
@@ -481,7 +705,7 @@
 </file>
 
 <file path=word/footnotes.xml><?xml version="1.0" encoding="utf-8"?>
-<w:footnotes xmlns:wpc="http://schemas.microsoft.com/office/word/2010/wordprocessingCanvas" xmlns:mc="http://schemas.openxmlformats.org/markup-compatibility/2006" xmlns:o="urn:schemas-microsoft-com:office:office" xmlns:r="http://schemas.openxmlformats.org/officeDocument/2006/relationships" xmlns:m="http://schemas.openxmlformats.org/officeDocument/2006/math" xmlns:v="urn:schemas-microsoft-com:vml" xmlns:wp14="http://schemas.microsoft.com/office/word/2010/wordprocessingDrawing" xmlns:wp="http://schemas.openxmlformats.org/drawingml/2006/wordprocessingDrawing" xmlns:w10="urn:schemas-microsoft-com:office:word" xmlns:w="http://schemas.openxmlformats.org/wordprocessingml/2006/main" xmlns:w14="http://schemas.microsoft.com/office/word/2010/wordml" xmlns:w15="http://schemas.microsoft.com/office/word/2012/wordml" xmlns:wpg="http://schemas.microsoft.com/office/word/2010/wordprocessingGroup" xmlns:wpi="http://schemas.microsoft.com/office/word/2010/wordprocessingInk" xmlns:wne="http://schemas.microsoft.com/office/word/2006/wordml" xmlns:wps="http://schemas.microsoft.com/office/word/2010/wordprocessingShape" mc:Ignorable="w14 w15 wp14">
+<w:footnotes xmlns:wpc="http://schemas.microsoft.com/office/word/2010/wordprocessingCanvas" xmlns:cx="http://schemas.microsoft.com/office/drawing/2014/chartex" xmlns:cx1="http://schemas.microsoft.com/office/drawing/2015/9/8/chartex" xmlns:cx2="http://schemas.microsoft.com/office/drawing/2015/10/21/chartex" xmlns:cx3="http://schemas.microsoft.com/office/drawing/2016/5/9/chartex" xmlns:cx4="http://schemas.microsoft.com/office/drawing/2016/5/10/chartex" xmlns:cx5="http://schemas.microsoft.com/office/drawing/2016/5/11/chartex" xmlns:cx6="http://schemas.microsoft.com/office/drawing/2016/5/12/chartex" xmlns:cx7="http://schemas.microsoft.com/office/drawing/2016/5/13/chartex" xmlns:cx8="http://schemas.microsoft.com/office/drawing/2016/5/14/chartex" xmlns:mc="http://schemas.openxmlformats.org/markup-compatibility/2006" xmlns:aink="http://schemas.microsoft.com/office/drawing/2016/ink" xmlns:am3d="http://schemas.microsoft.com/office/drawing/2017/model3d" xmlns:o="urn:schemas-microsoft-com:office:office" xmlns:oel="http://schemas.microsoft.com/office/2019/extlst" xmlns:r="http://schemas.openxmlformats.org/officeDocument/2006/relationships" xmlns:m="http://schemas.openxmlformats.org/officeDocument/2006/math" xmlns:v="urn:schemas-microsoft-com:vml" xmlns:wp14="http://schemas.microsoft.com/office/word/2010/wordprocessingDrawing" xmlns:wp="http://schemas.openxmlformats.org/drawingml/2006/wordprocessingDrawing" xmlns:w10="urn:schemas-microsoft-com:office:word" xmlns:w="http://schemas.openxmlformats.org/wordprocessingml/2006/main" xmlns:w14="http://schemas.microsoft.com/office/word/2010/wordml" xmlns:w15="http://schemas.microsoft.com/office/word/2012/wordml" xmlns:w16cex="http://schemas.microsoft.com/office/word/2018/wordml/cex" xmlns:w16cid="http://schemas.microsoft.com/office/word/2016/wordml/cid" xmlns:w16="http://schemas.microsoft.com/office/word/2018/wordml" xmlns:w16du="http://schemas.microsoft.com/office/word/2023/wordml/word16du" xmlns:w16sdtdh="http://schemas.microsoft.com/office/word/2020/wordml/sdtdatahash" xmlns:w16sdtfl="http://schemas.microsoft.com/office/word/2024/wordml/sdtformatlock" xmlns:w16se="http://schemas.microsoft.com/office/word/2015/wordml/symex" xmlns:wpg="http://schemas.microsoft.com/office/word/2010/wordprocessingGroup" xmlns:wpi="http://schemas.microsoft.com/office/word/2010/wordprocessingInk" xmlns:wne="http://schemas.microsoft.com/office/word/2006/wordml" xmlns:wps="http://schemas.microsoft.com/office/word/2010/wordprocessingShape" mc:Ignorable="w14 w15 w16se w16cid w16 w16cex w16sdtdh w16sdtfl w16du wp14">
   <w:footnote w:type="separator" w:id="-1">
     <w:p>
       <w:pPr>
@@ -506,7 +730,7 @@
 </file>
 
 <file path=word/header1.xml><?xml version="1.0" encoding="utf-8"?>
-<w:hdr xmlns:wpc="http://schemas.microsoft.com/office/word/2010/wordprocessingCanvas" xmlns:mc="http://schemas.openxmlformats.org/markup-compatibility/2006" xmlns:o="urn:schemas-microsoft-com:office:office" xmlns:r="http://schemas.openxmlformats.org/officeDocument/2006/relationships" xmlns:m="http://schemas.openxmlformats.org/officeDocument/2006/math" xmlns:v="urn:schemas-microsoft-com:vml" xmlns:wp14="http://schemas.microsoft.com/office/word/2010/wordprocessingDrawing" xmlns:wp="http://schemas.openxmlformats.org/drawingml/2006/wordprocessingDrawing" xmlns:w10="urn:schemas-microsoft-com:office:word" xmlns:w="http://schemas.openxmlformats.org/wordprocessingml/2006/main" xmlns:w14="http://schemas.microsoft.com/office/word/2010/wordml" xmlns:w15="http://schemas.microsoft.com/office/word/2012/wordml" xmlns:wpg="http://schemas.microsoft.com/office/word/2010/wordprocessingGroup" xmlns:wpi="http://schemas.microsoft.com/office/word/2010/wordprocessingInk" xmlns:wne="http://schemas.microsoft.com/office/word/2006/wordml" xmlns:wps="http://schemas.microsoft.com/office/word/2010/wordprocessingShape" mc:Ignorable="w14 w15 wp14">
+<w:hdr xmlns:wpc="http://schemas.microsoft.com/office/word/2010/wordprocessingCanvas" xmlns:cx="http://schemas.microsoft.com/office/drawing/2014/chartex" xmlns:cx1="http://schemas.microsoft.com/office/drawing/2015/9/8/chartex" xmlns:cx2="http://schemas.microsoft.com/office/drawing/2015/10/21/chartex" xmlns:cx3="http://schemas.microsoft.com/office/drawing/2016/5/9/chartex" xmlns:cx4="http://schemas.microsoft.com/office/drawing/2016/5/10/chartex" xmlns:cx5="http://schemas.microsoft.com/office/drawing/2016/5/11/chartex" xmlns:cx6="http://schemas.microsoft.com/office/drawing/2016/5/12/chartex" xmlns:cx7="http://schemas.microsoft.com/office/drawing/2016/5/13/chartex" xmlns:cx8="http://schemas.microsoft.com/office/drawing/2016/5/14/chartex" xmlns:mc="http://schemas.openxmlformats.org/markup-compatibility/2006" xmlns:aink="http://schemas.microsoft.com/office/drawing/2016/ink" xmlns:am3d="http://schemas.microsoft.com/office/drawing/2017/model3d" xmlns:o="urn:schemas-microsoft-com:office:office" xmlns:oel="http://schemas.microsoft.com/office/2019/extlst" xmlns:r="http://schemas.openxmlformats.org/officeDocument/2006/relationships" xmlns:m="http://schemas.openxmlformats.org/officeDocument/2006/math" xmlns:v="urn:schemas-microsoft-com:vml" xmlns:wp14="http://schemas.microsoft.com/office/word/2010/wordprocessingDrawing" xmlns:wp="http://schemas.openxmlformats.org/drawingml/2006/wordprocessingDrawing" xmlns:w10="urn:schemas-microsoft-com:office:word" xmlns:w="http://schemas.openxmlformats.org/wordprocessingml/2006/main" xmlns:w14="http://schemas.microsoft.com/office/word/2010/wordml" xmlns:w15="http://schemas.microsoft.com/office/word/2012/wordml" xmlns:w16cex="http://schemas.microsoft.com/office/word/2018/wordml/cex" xmlns:w16cid="http://schemas.microsoft.com/office/word/2016/wordml/cid" xmlns:w16="http://schemas.microsoft.com/office/word/2018/wordml" xmlns:w16du="http://schemas.microsoft.com/office/word/2023/wordml/word16du" xmlns:w16sdtdh="http://schemas.microsoft.com/office/word/2020/wordml/sdtdatahash" xmlns:w16sdtfl="http://schemas.microsoft.com/office/word/2024/wordml/sdtformatlock" xmlns:w16se="http://schemas.microsoft.com/office/word/2015/wordml/symex" xmlns:wpg="http://schemas.microsoft.com/office/word/2010/wordprocessingGroup" xmlns:wpi="http://schemas.microsoft.com/office/word/2010/wordprocessingInk" xmlns:wne="http://schemas.microsoft.com/office/word/2006/wordml" xmlns:wps="http://schemas.microsoft.com/office/word/2010/wordprocessingShape" mc:Ignorable="w14 w15 w16se w16cid w16 w16cex w16sdtdh w16sdtfl w16du wp14">
   <w:p>
     <w:pPr>
       <w:pStyle w:val="Header"/>
@@ -519,7 +743,7 @@
 </file>
 
 <file path=word/styles.xml><?xml version="1.0" encoding="utf-8"?>
-<w:styles xmlns:mc="http://schemas.openxmlformats.org/markup-compatibility/2006" xmlns:r="http://schemas.openxmlformats.org/officeDocument/2006/relationships" xmlns:w="http://schemas.openxmlformats.org/wordprocessingml/2006/main" xmlns:w14="http://schemas.microsoft.com/office/word/2010/wordml" xmlns:w15="http://schemas.microsoft.com/office/word/2012/wordml" mc:Ignorable="w14 w15">
+<w:styles xmlns:mc="http://schemas.openxmlformats.org/markup-compatibility/2006" xmlns:r="http://schemas.openxmlformats.org/officeDocument/2006/relationships" xmlns:w="http://schemas.openxmlformats.org/wordprocessingml/2006/main" xmlns:w14="http://schemas.microsoft.com/office/word/2010/wordml" xmlns:w15="http://schemas.microsoft.com/office/word/2012/wordml" xmlns:w16cex="http://schemas.microsoft.com/office/word/2018/wordml/cex" xmlns:w16cid="http://schemas.microsoft.com/office/word/2016/wordml/cid" xmlns:w16="http://schemas.microsoft.com/office/word/2018/wordml" xmlns:w16du="http://schemas.microsoft.com/office/word/2023/wordml/word16du" xmlns:w16sdtdh="http://schemas.microsoft.com/office/word/2020/wordml/sdtdatahash" xmlns:w16sdtfl="http://schemas.microsoft.com/office/word/2024/wordml/sdtformatlock" xmlns:w16se="http://schemas.microsoft.com/office/word/2015/wordml/symex" mc:Ignorable="w14 w15 w16se w16cid w16 w16cex w16sdtdh w16sdtfl w16du">
   <w:docDefaults>
     <w:rPrDefault>
       <w:rPr>
@@ -535,7 +759,7 @@
       </w:pPr>
     </w:pPrDefault>
   </w:docDefaults>
-  <w:latentStyles w:defLockedState="0" w:defUIPriority="99" w:defSemiHidden="0" w:defUnhideWhenUsed="0" w:defQFormat="0" w:count="371">
+  <w:latentStyles w:defLockedState="0" w:defUIPriority="99" w:defSemiHidden="0" w:defUnhideWhenUsed="0" w:defQFormat="0" w:count="376">
     <w:lsdException w:name="Normal" w:uiPriority="0" w:qFormat="1"/>
     <w:lsdException w:name="heading 1" w:uiPriority="9" w:qFormat="1"/>
     <w:lsdException w:name="heading 2" w:semiHidden="1" w:uiPriority="9" w:unhideWhenUsed="1" w:qFormat="1"/>
@@ -907,6 +1131,11 @@
     <w:lsdException w:name="List Table 5 Dark Accent 6" w:uiPriority="50"/>
     <w:lsdException w:name="List Table 6 Colorful Accent 6" w:uiPriority="51"/>
     <w:lsdException w:name="List Table 7 Colorful Accent 6" w:uiPriority="52"/>
+    <w:lsdException w:name="Mention" w:semiHidden="1" w:unhideWhenUsed="1"/>
+    <w:lsdException w:name="Smart Hyperlink" w:semiHidden="1" w:unhideWhenUsed="1"/>
+    <w:lsdException w:name="Hashtag" w:semiHidden="1" w:unhideWhenUsed="1"/>
+    <w:lsdException w:name="Unresolved Mention" w:semiHidden="1" w:unhideWhenUsed="1"/>
+    <w:lsdException w:name="Smart Link" w:semiHidden="1" w:unhideWhenUsed="1"/>
   </w:latentStyles>
   <w:style w:type="paragraph" w:default="1" w:styleId="Normal">
     <w:name w:val="Normal"/>

</xml_diff>